<commit_message>
feat: tambahkan sertifikat HackerRank React dan kompetensi React.js di skills matrix & hero pillars
</commit_message>
<xml_diff>
--- a/Assets/CV/CV-Rangga Cahyadi-IT-Admin.docx
+++ b/Assets/CV/CV-Rangga Cahyadi-IT-Admin.docx
@@ -45,21 +45,219 @@
       <w:r>
         <w:rPr>
           <w:rFonts w:cs="Times New Roman"/>
+          <w:b/>
+          <w:bCs/>
+          <w:sz w:val="24"/>
+          <w:szCs w:val="24"/>
+          <w:lang w:val="it-IT"/>
+        </w:rPr>
+        <w:t>Bandung</w:t>
+      </w:r>
+      <w:r>
+        <w:rPr>
+          <w:rFonts w:cs="Times New Roman"/>
+          <w:b/>
+          <w:bCs/>
+          <w:sz w:val="24"/>
+          <w:szCs w:val="24"/>
+          <w:lang w:val="it-IT"/>
+        </w:rPr>
+        <w:t xml:space="preserve">, </w:t>
+      </w:r>
+      <w:r>
+        <w:rPr>
+          <w:rFonts w:cs="Times New Roman"/>
+          <w:b/>
+          <w:bCs/>
+          <w:sz w:val="24"/>
+          <w:szCs w:val="24"/>
+          <w:lang w:val="it-IT"/>
+        </w:rPr>
+        <w:t>Jawa Barat</w:t>
+      </w:r>
+      <w:r>
+        <w:rPr>
+          <w:rFonts w:cs="Times New Roman"/>
+          <w:b/>
+          <w:bCs/>
+          <w:sz w:val="24"/>
+          <w:szCs w:val="24"/>
+          <w:lang w:val="it-IT"/>
+        </w:rPr>
+        <w:t xml:space="preserve"> </w:t>
+      </w:r>
+      <w:r>
+        <w:rPr>
+          <w:rFonts w:cs="Times New Roman"/>
+          <w:b/>
+          <w:bCs/>
+          <w:sz w:val="24"/>
+          <w:szCs w:val="24"/>
+          <w:lang w:val="it-IT"/>
+        </w:rPr>
+        <w:t xml:space="preserve">| </w:t>
+      </w:r>
+      <w:r>
+        <w:rPr>
+          <w:rFonts w:cs="Times New Roman"/>
+          <w:b/>
+          <w:bCs/>
+          <w:sz w:val="24"/>
+          <w:szCs w:val="24"/>
+          <w:lang w:val="it-IT"/>
+        </w:rPr>
+        <w:t xml:space="preserve">0815-3923-5487 | tilameorangga@gmail.com </w:t>
+      </w:r>
+    </w:p>
+    <w:p>
+      <w:pPr>
+        <w:spacing w:after="0" w:line="276" w:lineRule="auto"/>
+        <w:ind w:left="2694" w:right="333"/>
+        <w:jc w:val="center"/>
+        <w:rPr>
+          <w:rFonts w:cs="Times New Roman"/>
+          <w:b/>
+          <w:bCs/>
+          <w:sz w:val="24"/>
+          <w:szCs w:val="24"/>
+          <w:lang w:val="it-IT"/>
+        </w:rPr>
+      </w:pPr>
+      <w:r>
+        <w:rPr>
+          <w:rFonts w:cs="Times New Roman"/>
+          <w:b/>
+          <w:bCs/>
+          <w:sz w:val="24"/>
+          <w:szCs w:val="24"/>
+        </w:rPr>
+        <w:fldChar w:fldCharType="begin"/>
+      </w:r>
+      <w:r>
+        <w:rPr>
+          <w:rFonts w:cs="Times New Roman"/>
+          <w:b/>
+          <w:bCs/>
+          <w:sz w:val="24"/>
+          <w:szCs w:val="24"/>
+          <w:lang w:val="it-IT"/>
+        </w:rPr>
+        <w:instrText>HYPERLINK "https://rangga-cahyadi-web-portofolio.vercel.app/"</w:instrText>
+      </w:r>
+      <w:r>
+        <w:rPr>
+          <w:rFonts w:cs="Times New Roman"/>
+          <w:b/>
+          <w:bCs/>
+          <w:sz w:val="24"/>
+          <w:szCs w:val="24"/>
+        </w:rPr>
+      </w:r>
+      <w:r>
+        <w:rPr>
+          <w:rFonts w:cs="Times New Roman"/>
+          <w:b/>
+          <w:bCs/>
+          <w:sz w:val="24"/>
+          <w:szCs w:val="24"/>
+        </w:rPr>
+        <w:fldChar w:fldCharType="separate"/>
+      </w:r>
+      <w:r>
+        <w:rPr>
+          <w:rStyle w:val="Hyperlink"/>
+          <w:rFonts w:cs="Times New Roman"/>
+          <w:b/>
+          <w:bCs/>
+          <w:color w:val="000000" w:themeColor="text1"/>
+          <w:sz w:val="24"/>
+          <w:szCs w:val="24"/>
+          <w:u w:val="none"/>
+          <w:lang w:val="it-IT"/>
+        </w:rPr>
+        <w:t xml:space="preserve">Rangga Cahyadi | </w:t>
+      </w:r>
+      <w:r>
+        <w:rPr>
+          <w:rStyle w:val="Hyperlink"/>
+          <w:rFonts w:cs="Times New Roman"/>
+          <w:b/>
+          <w:bCs/>
+          <w:color w:val="000000" w:themeColor="text1"/>
+          <w:sz w:val="24"/>
+          <w:szCs w:val="24"/>
+          <w:u w:val="none"/>
+          <w:lang w:val="it-IT"/>
+        </w:rPr>
+        <w:t>Web-</w:t>
+      </w:r>
+      <w:r>
+        <w:rPr>
+          <w:rStyle w:val="Hyperlink"/>
+          <w:rFonts w:cs="Times New Roman"/>
+          <w:b/>
+          <w:bCs/>
+          <w:color w:val="000000" w:themeColor="text1"/>
+          <w:sz w:val="24"/>
+          <w:szCs w:val="24"/>
+          <w:u w:val="none"/>
+          <w:lang w:val="it-IT"/>
+        </w:rPr>
+        <w:t>Portfolio</w:t>
+      </w:r>
+      <w:r>
+        <w:rPr>
+          <w:rFonts w:cs="Times New Roman"/>
+          <w:b/>
+          <w:bCs/>
+          <w:sz w:val="24"/>
+          <w:szCs w:val="24"/>
+          <w:lang w:val="it-IT"/>
+        </w:rPr>
+        <w:fldChar w:fldCharType="end"/>
+      </w:r>
+      <w:r>
+        <w:rPr>
+          <w:rFonts w:cs="Times New Roman"/>
+          <w:b/>
+          <w:bCs/>
+          <w:sz w:val="24"/>
+          <w:szCs w:val="24"/>
+          <w:lang w:val="it-IT"/>
+        </w:rPr>
+        <w:t xml:space="preserve"> </w:t>
+      </w:r>
+    </w:p>
+    <w:p>
+      <w:pPr>
+        <w:spacing w:after="0" w:line="276" w:lineRule="auto"/>
+        <w:ind w:left="2694" w:right="333"/>
+        <w:jc w:val="both"/>
+        <w:rPr>
+          <w:rFonts w:cs="Times New Roman"/>
+          <w:sz w:val="24"/>
+          <w:szCs w:val="24"/>
+          <w:lang w:val="en-ID"/>
+        </w:rPr>
+      </w:pPr>
+      <w:r>
+        <w:rPr>
+          <w:rFonts w:cs="Times New Roman"/>
           <w:noProof/>
           <w:sz w:val="24"/>
           <w:szCs w:val="24"/>
         </w:rPr>
         <w:drawing>
-          <wp:anchor distT="0" distB="0" distL="114300" distR="114300" simplePos="0" relativeHeight="251666432" behindDoc="0" locked="0" layoutInCell="1" allowOverlap="1" wp14:anchorId="0AF5D353" wp14:editId="11EAF379">
+          <wp:anchor distT="0" distB="0" distL="114300" distR="114300" simplePos="0" relativeHeight="251666432" behindDoc="0" locked="0" layoutInCell="1" allowOverlap="1" wp14:anchorId="0AF5D353" wp14:editId="51AA0E64">
             <wp:simplePos x="0" y="0"/>
             <wp:positionH relativeFrom="column">
-              <wp:posOffset>483870</wp:posOffset>
+              <wp:posOffset>486718</wp:posOffset>
             </wp:positionH>
             <wp:positionV relativeFrom="paragraph">
-              <wp:posOffset>171323</wp:posOffset>
+              <wp:posOffset>33020</wp:posOffset>
             </wp:positionV>
-            <wp:extent cx="1097915" cy="1405890"/>
-            <wp:effectExtent l="0" t="0" r="6985" b="3810"/>
+            <wp:extent cx="1065186" cy="1363980"/>
+            <wp:effectExtent l="0" t="0" r="1905" b="7620"/>
             <wp:wrapNone/>
             <wp:docPr id="167363" name="Picture 6"/>
             <wp:cNvGraphicFramePr>
@@ -90,7 +288,7 @@
                   <pic:spPr bwMode="auto">
                     <a:xfrm>
                       <a:off x="0" y="0"/>
-                      <a:ext cx="1097915" cy="1405890"/>
+                      <a:ext cx="1078285" cy="1380753"/>
                     </a:xfrm>
                     <a:prstGeom prst="rect">
                       <a:avLst/>
@@ -117,96 +315,6 @@
           </wp:anchor>
         </w:drawing>
       </w:r>
-      <w:r>
-        <w:rPr>
-          <w:rFonts w:cs="Times New Roman"/>
-          <w:b/>
-          <w:bCs/>
-          <w:sz w:val="24"/>
-          <w:szCs w:val="24"/>
-          <w:lang w:val="it-IT"/>
-        </w:rPr>
-        <w:t>Bandung</w:t>
-      </w:r>
-      <w:r>
-        <w:rPr>
-          <w:rFonts w:cs="Times New Roman"/>
-          <w:b/>
-          <w:bCs/>
-          <w:sz w:val="24"/>
-          <w:szCs w:val="24"/>
-          <w:lang w:val="it-IT"/>
-        </w:rPr>
-        <w:t xml:space="preserve">, </w:t>
-      </w:r>
-      <w:r>
-        <w:rPr>
-          <w:rFonts w:cs="Times New Roman"/>
-          <w:b/>
-          <w:bCs/>
-          <w:sz w:val="24"/>
-          <w:szCs w:val="24"/>
-          <w:lang w:val="it-IT"/>
-        </w:rPr>
-        <w:t>Jawa Barat</w:t>
-      </w:r>
-      <w:r>
-        <w:rPr>
-          <w:rFonts w:cs="Times New Roman"/>
-          <w:b/>
-          <w:bCs/>
-          <w:sz w:val="24"/>
-          <w:szCs w:val="24"/>
-          <w:lang w:val="it-IT"/>
-        </w:rPr>
-        <w:t xml:space="preserve"> </w:t>
-      </w:r>
-      <w:r>
-        <w:rPr>
-          <w:rFonts w:cs="Times New Roman"/>
-          <w:b/>
-          <w:bCs/>
-          <w:sz w:val="24"/>
-          <w:szCs w:val="24"/>
-          <w:lang w:val="it-IT"/>
-        </w:rPr>
-        <w:t xml:space="preserve">| </w:t>
-      </w:r>
-      <w:r>
-        <w:rPr>
-          <w:rFonts w:cs="Times New Roman"/>
-          <w:b/>
-          <w:bCs/>
-          <w:sz w:val="24"/>
-          <w:szCs w:val="24"/>
-          <w:lang w:val="it-IT"/>
-        </w:rPr>
-        <w:t xml:space="preserve">0815-3923-5487 | tilameorangga@gmail.com </w:t>
-      </w:r>
-      <w:r>
-        <w:rPr>
-          <w:rFonts w:cs="Times New Roman"/>
-          <w:b/>
-          <w:bCs/>
-          <w:sz w:val="24"/>
-          <w:szCs w:val="24"/>
-          <w:lang w:val="it-IT"/>
-        </w:rPr>
-        <w:t xml:space="preserve"> </w:t>
-      </w:r>
-    </w:p>
-    <w:p>
-      <w:pPr>
-        <w:spacing w:after="0" w:line="276" w:lineRule="auto"/>
-        <w:ind w:left="2694" w:right="333"/>
-        <w:jc w:val="both"/>
-        <w:rPr>
-          <w:rFonts w:cs="Times New Roman"/>
-          <w:sz w:val="24"/>
-          <w:szCs w:val="24"/>
-          <w:lang w:val="en-ID"/>
-        </w:rPr>
-      </w:pPr>
       <w:proofErr w:type="spellStart"/>
       <w:r>
         <w:rPr>
@@ -4030,7 +4138,6 @@
           <w:sz w:val="24"/>
           <w:szCs w:val="24"/>
         </w:rPr>
-        <w:lastRenderedPageBreak/>
         <w:t>P</w:t>
       </w:r>
       <w:r>
@@ -4596,6 +4703,79 @@
           <w:szCs w:val="24"/>
         </w:rPr>
         <w:t xml:space="preserve"> </w:t>
+      </w:r>
+    </w:p>
+    <w:p>
+      <w:pPr>
+        <w:pStyle w:val="ListParagraph"/>
+        <w:numPr>
+          <w:ilvl w:val="0"/>
+          <w:numId w:val="11"/>
+        </w:numPr>
+        <w:spacing w:after="0" w:line="276" w:lineRule="auto"/>
+        <w:ind w:left="851" w:right="333" w:hanging="284"/>
+        <w:jc w:val="both"/>
+        <w:rPr>
+          <w:rFonts w:cs="Times New Roman"/>
+          <w:sz w:val="24"/>
+          <w:szCs w:val="24"/>
+        </w:rPr>
+      </w:pPr>
+      <w:r>
+        <w:rPr>
+          <w:rFonts w:cs="Times New Roman"/>
+          <w:sz w:val="24"/>
+          <w:szCs w:val="24"/>
+        </w:rPr>
+        <w:t>Frontend</w:t>
+      </w:r>
+      <w:r>
+        <w:rPr>
+          <w:rFonts w:cs="Times New Roman"/>
+          <w:sz w:val="24"/>
+          <w:szCs w:val="24"/>
+        </w:rPr>
+        <w:t xml:space="preserve"> </w:t>
+      </w:r>
+      <w:r>
+        <w:rPr>
+          <w:rFonts w:cs="Times New Roman"/>
+          <w:sz w:val="24"/>
+          <w:szCs w:val="24"/>
+        </w:rPr>
+        <w:t>Developer</w:t>
+      </w:r>
+      <w:r>
+        <w:rPr>
+          <w:rFonts w:cs="Times New Roman"/>
+          <w:sz w:val="24"/>
+          <w:szCs w:val="24"/>
+        </w:rPr>
+        <w:t xml:space="preserve"> </w:t>
+      </w:r>
+      <w:r>
+        <w:rPr>
+          <w:rFonts w:cs="Times New Roman"/>
+          <w:sz w:val="24"/>
+          <w:szCs w:val="24"/>
+        </w:rPr>
+        <w:t>(</w:t>
+      </w:r>
+      <w:r>
+        <w:rPr>
+          <w:rFonts w:cs="Times New Roman"/>
+          <w:sz w:val="24"/>
+          <w:szCs w:val="24"/>
+        </w:rPr>
+        <w:t>React</w:t>
+      </w:r>
+      <w:r>
+        <w:rPr>
+          <w:rFonts w:cs="Times New Roman"/>
+          <w:sz w:val="24"/>
+          <w:szCs w:val="24"/>
+        </w:rPr>
+        <w:t>)</w:t>
       </w:r>
     </w:p>
     <w:p>

</xml_diff>

<commit_message>
feat: tambahkan link profil GitHub dan HackerRank di Hero, Contact, Footer, dan Certificate Modal
</commit_message>
<xml_diff>
--- a/Assets/CV/CV-Rangga Cahyadi-IT-Admin.docx
+++ b/Assets/CV/CV-Rangga Cahyadi-IT-Admin.docx
@@ -123,99 +123,176 @@
           <w:lang w:val="it-IT"/>
         </w:rPr>
       </w:pPr>
-      <w:r>
-        <w:rPr>
-          <w:rFonts w:cs="Times New Roman"/>
-          <w:b/>
-          <w:bCs/>
-          <w:sz w:val="24"/>
-          <w:szCs w:val="24"/>
-        </w:rPr>
-        <w:fldChar w:fldCharType="begin"/>
-      </w:r>
-      <w:r>
-        <w:rPr>
-          <w:rFonts w:cs="Times New Roman"/>
-          <w:b/>
-          <w:bCs/>
-          <w:sz w:val="24"/>
-          <w:szCs w:val="24"/>
-          <w:lang w:val="it-IT"/>
-        </w:rPr>
-        <w:instrText>HYPERLINK "https://rangga-cahyadi-web-portofolio.vercel.app/"</w:instrText>
-      </w:r>
-      <w:r>
-        <w:rPr>
-          <w:rFonts w:cs="Times New Roman"/>
-          <w:b/>
-          <w:bCs/>
-          <w:sz w:val="24"/>
-          <w:szCs w:val="24"/>
-        </w:rPr>
-      </w:r>
-      <w:r>
-        <w:rPr>
-          <w:rFonts w:cs="Times New Roman"/>
-          <w:b/>
-          <w:bCs/>
-          <w:sz w:val="24"/>
-          <w:szCs w:val="24"/>
-        </w:rPr>
-        <w:fldChar w:fldCharType="separate"/>
-      </w:r>
-      <w:r>
-        <w:rPr>
-          <w:rStyle w:val="Hyperlink"/>
-          <w:rFonts w:cs="Times New Roman"/>
-          <w:b/>
-          <w:bCs/>
-          <w:color w:val="000000" w:themeColor="text1"/>
-          <w:sz w:val="24"/>
-          <w:szCs w:val="24"/>
-          <w:u w:val="none"/>
-          <w:lang w:val="it-IT"/>
-        </w:rPr>
-        <w:t xml:space="preserve">Rangga Cahyadi | </w:t>
-      </w:r>
-      <w:r>
-        <w:rPr>
-          <w:rStyle w:val="Hyperlink"/>
-          <w:rFonts w:cs="Times New Roman"/>
-          <w:b/>
-          <w:bCs/>
-          <w:color w:val="000000" w:themeColor="text1"/>
-          <w:sz w:val="24"/>
-          <w:szCs w:val="24"/>
-          <w:u w:val="none"/>
-          <w:lang w:val="it-IT"/>
-        </w:rPr>
-        <w:t>Web-</w:t>
-      </w:r>
-      <w:r>
-        <w:rPr>
-          <w:rStyle w:val="Hyperlink"/>
-          <w:rFonts w:cs="Times New Roman"/>
-          <w:b/>
-          <w:bCs/>
-          <w:color w:val="000000" w:themeColor="text1"/>
-          <w:sz w:val="24"/>
-          <w:szCs w:val="24"/>
-          <w:u w:val="none"/>
-          <w:lang w:val="it-IT"/>
-        </w:rPr>
-        <w:t>Portfolio</w:t>
-      </w:r>
-      <w:r>
-        <w:rPr>
-          <w:rFonts w:cs="Times New Roman"/>
-          <w:b/>
-          <w:bCs/>
-          <w:sz w:val="24"/>
-          <w:szCs w:val="24"/>
-          <w:lang w:val="it-IT"/>
-        </w:rPr>
-        <w:fldChar w:fldCharType="end"/>
-      </w:r>
+      <w:hyperlink r:id="rId8" w:history="1">
+        <w:r>
+          <w:rPr>
+            <w:rStyle w:val="Hyperlink"/>
+            <w:rFonts w:cs="Times New Roman"/>
+            <w:b/>
+            <w:bCs/>
+            <w:color w:val="000000" w:themeColor="text1"/>
+            <w:sz w:val="24"/>
+            <w:szCs w:val="24"/>
+            <w:u w:val="none"/>
+            <w:lang w:val="it-IT"/>
+          </w:rPr>
+          <w:t>R</w:t>
+        </w:r>
+        <w:r>
+          <w:rPr>
+            <w:rStyle w:val="Hyperlink"/>
+            <w:rFonts w:cs="Times New Roman"/>
+            <w:b/>
+            <w:bCs/>
+            <w:color w:val="000000" w:themeColor="text1"/>
+            <w:sz w:val="24"/>
+            <w:szCs w:val="24"/>
+            <w:u w:val="none"/>
+            <w:lang w:val="it-IT"/>
+          </w:rPr>
+          <w:t>angga-</w:t>
+        </w:r>
+        <w:r>
+          <w:rPr>
+            <w:rStyle w:val="Hyperlink"/>
+            <w:rFonts w:cs="Times New Roman"/>
+            <w:b/>
+            <w:bCs/>
+            <w:color w:val="000000" w:themeColor="text1"/>
+            <w:sz w:val="24"/>
+            <w:szCs w:val="24"/>
+            <w:u w:val="none"/>
+            <w:lang w:val="it-IT"/>
+          </w:rPr>
+          <w:t>C</w:t>
+        </w:r>
+        <w:r>
+          <w:rPr>
+            <w:rStyle w:val="Hyperlink"/>
+            <w:rFonts w:cs="Times New Roman"/>
+            <w:b/>
+            <w:bCs/>
+            <w:color w:val="000000" w:themeColor="text1"/>
+            <w:sz w:val="24"/>
+            <w:szCs w:val="24"/>
+            <w:u w:val="none"/>
+            <w:lang w:val="it-IT"/>
+          </w:rPr>
+          <w:t>ahyadi-</w:t>
+        </w:r>
+        <w:r>
+          <w:rPr>
+            <w:rStyle w:val="Hyperlink"/>
+            <w:rFonts w:cs="Times New Roman"/>
+            <w:b/>
+            <w:bCs/>
+            <w:color w:val="000000" w:themeColor="text1"/>
+            <w:sz w:val="24"/>
+            <w:szCs w:val="24"/>
+            <w:u w:val="none"/>
+            <w:lang w:val="it-IT"/>
+          </w:rPr>
+          <w:t>W</w:t>
+        </w:r>
+        <w:r>
+          <w:rPr>
+            <w:rStyle w:val="Hyperlink"/>
+            <w:rFonts w:cs="Times New Roman"/>
+            <w:b/>
+            <w:bCs/>
+            <w:color w:val="000000" w:themeColor="text1"/>
+            <w:sz w:val="24"/>
+            <w:szCs w:val="24"/>
+            <w:u w:val="none"/>
+            <w:lang w:val="it-IT"/>
+          </w:rPr>
+          <w:t>eb-</w:t>
+        </w:r>
+        <w:r>
+          <w:rPr>
+            <w:rStyle w:val="Hyperlink"/>
+            <w:rFonts w:cs="Times New Roman"/>
+            <w:b/>
+            <w:bCs/>
+            <w:color w:val="000000" w:themeColor="text1"/>
+            <w:sz w:val="24"/>
+            <w:szCs w:val="24"/>
+            <w:u w:val="none"/>
+            <w:lang w:val="it-IT"/>
+          </w:rPr>
+          <w:t>P</w:t>
+        </w:r>
+        <w:r>
+          <w:rPr>
+            <w:rStyle w:val="Hyperlink"/>
+            <w:rFonts w:cs="Times New Roman"/>
+            <w:b/>
+            <w:bCs/>
+            <w:color w:val="000000" w:themeColor="text1"/>
+            <w:sz w:val="24"/>
+            <w:szCs w:val="24"/>
+            <w:u w:val="none"/>
+            <w:lang w:val="it-IT"/>
+          </w:rPr>
+          <w:t>ortofolio.</w:t>
+        </w:r>
+        <w:r>
+          <w:rPr>
+            <w:rStyle w:val="Hyperlink"/>
+            <w:rFonts w:cs="Times New Roman"/>
+            <w:b/>
+            <w:bCs/>
+            <w:color w:val="000000" w:themeColor="text1"/>
+            <w:sz w:val="24"/>
+            <w:szCs w:val="24"/>
+            <w:u w:val="none"/>
+            <w:lang w:val="it-IT"/>
+          </w:rPr>
+          <w:t>V</w:t>
+        </w:r>
+        <w:r>
+          <w:rPr>
+            <w:rStyle w:val="Hyperlink"/>
+            <w:rFonts w:cs="Times New Roman"/>
+            <w:b/>
+            <w:bCs/>
+            <w:color w:val="000000" w:themeColor="text1"/>
+            <w:sz w:val="24"/>
+            <w:szCs w:val="24"/>
+            <w:u w:val="none"/>
+            <w:lang w:val="it-IT"/>
+          </w:rPr>
+          <w:t>ercel.</w:t>
+        </w:r>
+        <w:r>
+          <w:rPr>
+            <w:rStyle w:val="Hyperlink"/>
+            <w:rFonts w:cs="Times New Roman"/>
+            <w:b/>
+            <w:bCs/>
+            <w:color w:val="000000" w:themeColor="text1"/>
+            <w:sz w:val="24"/>
+            <w:szCs w:val="24"/>
+            <w:u w:val="none"/>
+            <w:lang w:val="it-IT"/>
+          </w:rPr>
+          <w:t>A</w:t>
+        </w:r>
+        <w:r>
+          <w:rPr>
+            <w:rStyle w:val="Hyperlink"/>
+            <w:rFonts w:cs="Times New Roman"/>
+            <w:b/>
+            <w:bCs/>
+            <w:color w:val="000000" w:themeColor="text1"/>
+            <w:sz w:val="24"/>
+            <w:szCs w:val="24"/>
+            <w:u w:val="none"/>
+            <w:lang w:val="it-IT"/>
+          </w:rPr>
+          <w:t>pp</w:t>
+        </w:r>
+      </w:hyperlink>
       <w:r>
         <w:rPr>
           <w:rFonts w:cs="Times New Roman"/>
@@ -248,16 +325,16 @@
           <w:szCs w:val="24"/>
         </w:rPr>
         <w:drawing>
-          <wp:anchor distT="0" distB="0" distL="114300" distR="114300" simplePos="0" relativeHeight="251666432" behindDoc="0" locked="0" layoutInCell="1" allowOverlap="1" wp14:anchorId="0AF5D353" wp14:editId="51AA0E64">
+          <wp:anchor distT="0" distB="0" distL="114300" distR="114300" simplePos="0" relativeHeight="251666432" behindDoc="0" locked="0" layoutInCell="1" allowOverlap="1" wp14:anchorId="0AF5D353" wp14:editId="4C5FA0D2">
             <wp:simplePos x="0" y="0"/>
             <wp:positionH relativeFrom="column">
-              <wp:posOffset>486718</wp:posOffset>
+              <wp:posOffset>452120</wp:posOffset>
             </wp:positionH>
             <wp:positionV relativeFrom="paragraph">
-              <wp:posOffset>33020</wp:posOffset>
+              <wp:posOffset>17780</wp:posOffset>
             </wp:positionV>
-            <wp:extent cx="1065186" cy="1363980"/>
-            <wp:effectExtent l="0" t="0" r="1905" b="7620"/>
+            <wp:extent cx="1082747" cy="1386467"/>
+            <wp:effectExtent l="0" t="0" r="3175" b="4445"/>
             <wp:wrapNone/>
             <wp:docPr id="167363" name="Picture 6"/>
             <wp:cNvGraphicFramePr>
@@ -273,7 +350,7 @@
                     </pic:cNvPicPr>
                   </pic:nvPicPr>
                   <pic:blipFill rotWithShape="1">
-                    <a:blip r:embed="rId8" cstate="print">
+                    <a:blip r:embed="rId9" cstate="print">
                       <a:extLst>
                         <a:ext uri="{28A0092B-C50C-407E-A947-70E740481C1C}">
                           <a14:useLocalDpi xmlns:a14="http://schemas.microsoft.com/office/drawing/2010/main" val="0"/>
@@ -288,7 +365,7 @@
                   <pic:spPr bwMode="auto">
                     <a:xfrm>
                       <a:off x="0" y="0"/>
-                      <a:ext cx="1078285" cy="1380753"/>
+                      <a:ext cx="1082747" cy="1386467"/>
                     </a:xfrm>
                     <a:prstGeom prst="rect">
                       <a:avLst/>
@@ -4582,12 +4659,12 @@
           <w:szCs w:val="24"/>
         </w:rPr>
         <w:sectPr>
-          <w:headerReference w:type="even" r:id="rId9"/>
-          <w:headerReference w:type="default" r:id="rId10"/>
-          <w:footerReference w:type="even" r:id="rId11"/>
-          <w:footerReference w:type="default" r:id="rId12"/>
-          <w:headerReference w:type="first" r:id="rId13"/>
-          <w:footerReference w:type="first" r:id="rId14"/>
+          <w:headerReference w:type="even" r:id="rId10"/>
+          <w:headerReference w:type="default" r:id="rId11"/>
+          <w:footerReference w:type="even" r:id="rId12"/>
+          <w:footerReference w:type="default" r:id="rId13"/>
+          <w:headerReference w:type="first" r:id="rId14"/>
+          <w:footerReference w:type="first" r:id="rId15"/>
           <w:pgSz w:w="12240" w:h="15840"/>
           <w:pgMar w:top="567" w:right="567" w:bottom="567" w:left="567" w:header="578" w:footer="289" w:gutter="0"/>
           <w:pgNumType w:start="1"/>

</xml_diff>